<commit_message>
chore: finding Mcc solution
</commit_message>
<xml_diff>
--- a/doc/PRJ_2113_D-sElectronique-POBJ-v0.0.1.docx
+++ b/doc/PRJ_2113_D-sElectronique-POBJ-v0.0.1.docx
@@ -1,6 +1,6 @@
 
 <file path=word/document.xml><?xml version="1.0" encoding="utf-8"?>
-<w:document xmlns:wpc="http://schemas.microsoft.com/office/word/2010/wordprocessingCanvas" xmlns:cx="http://schemas.microsoft.com/office/drawing/2014/chartex" xmlns:cx1="http://schemas.microsoft.com/office/drawing/2015/9/8/chartex" xmlns:cx2="http://schemas.microsoft.com/office/drawing/2015/10/21/chartex" xmlns:cx3="http://schemas.microsoft.com/office/drawing/2016/5/9/chartex" xmlns:cx4="http://schemas.microsoft.com/office/drawing/2016/5/10/chartex" xmlns:cx5="http://schemas.microsoft.com/office/drawing/2016/5/11/chartex" xmlns:cx6="http://schemas.microsoft.com/office/drawing/2016/5/12/chartex" xmlns:cx7="http://schemas.microsoft.com/office/drawing/2016/5/13/chartex" xmlns:cx8="http://schemas.microsoft.com/office/drawing/2016/5/14/chartex" xmlns:mc="http://schemas.openxmlformats.org/markup-compatibility/2006" xmlns:aink="http://schemas.microsoft.com/office/drawing/2016/ink" xmlns:am3d="http://schemas.microsoft.com/office/drawing/2017/model3d" xmlns:o="urn:schemas-microsoft-com:office:office" xmlns:oel="http://schemas.microsoft.com/office/2019/extlst" xmlns:r="http://schemas.openxmlformats.org/officeDocument/2006/relationships" xmlns:m="http://schemas.openxmlformats.org/officeDocument/2006/math" xmlns:v="urn:schemas-microsoft-com:vml" xmlns:wp14="http://schemas.microsoft.com/office/word/2010/wordprocessingDrawing" xmlns:wp="http://schemas.openxmlformats.org/drawingml/2006/wordprocessingDrawing" xmlns:w10="urn:schemas-microsoft-com:office:word" xmlns:w="http://schemas.openxmlformats.org/wordprocessingml/2006/main" xmlns:w14="http://schemas.microsoft.com/office/word/2010/wordml" xmlns:w15="http://schemas.microsoft.com/office/word/2012/wordml" xmlns:w16cex="http://schemas.microsoft.com/office/word/2018/wordml/cex" xmlns:w16cid="http://schemas.microsoft.com/office/word/2016/wordml/cid" xmlns:w16="http://schemas.microsoft.com/office/word/2018/wordml" xmlns:w16du="http://schemas.microsoft.com/office/word/2023/wordml/word16du" xmlns:w16sdtdh="http://schemas.microsoft.com/office/word/2020/wordml/sdtdatahash" xmlns:w16se="http://schemas.microsoft.com/office/word/2015/wordml/symex" xmlns:wpg="http://schemas.microsoft.com/office/word/2010/wordprocessingGroup" xmlns:wpi="http://schemas.microsoft.com/office/word/2010/wordprocessingInk" xmlns:wne="http://schemas.microsoft.com/office/word/2006/wordml" xmlns:wps="http://schemas.microsoft.com/office/word/2010/wordprocessingShape" mc:Ignorable="w14 w15 w16se w16cid w16 w16cex w16sdtdh wp14">
+<w:document xmlns:wpc="http://schemas.microsoft.com/office/word/2010/wordprocessingCanvas" xmlns:cx="http://schemas.microsoft.com/office/drawing/2014/chartex" xmlns:cx1="http://schemas.microsoft.com/office/drawing/2015/9/8/chartex" xmlns:cx2="http://schemas.microsoft.com/office/drawing/2015/10/21/chartex" xmlns:cx3="http://schemas.microsoft.com/office/drawing/2016/5/9/chartex" xmlns:cx4="http://schemas.microsoft.com/office/drawing/2016/5/10/chartex" xmlns:cx5="http://schemas.microsoft.com/office/drawing/2016/5/11/chartex" xmlns:cx6="http://schemas.microsoft.com/office/drawing/2016/5/12/chartex" xmlns:cx7="http://schemas.microsoft.com/office/drawing/2016/5/13/chartex" xmlns:cx8="http://schemas.microsoft.com/office/drawing/2016/5/14/chartex" xmlns:mc="http://schemas.openxmlformats.org/markup-compatibility/2006" xmlns:aink="http://schemas.microsoft.com/office/drawing/2016/ink" xmlns:am3d="http://schemas.microsoft.com/office/drawing/2017/model3d" xmlns:o="urn:schemas-microsoft-com:office:office" xmlns:r="http://schemas.openxmlformats.org/officeDocument/2006/relationships" xmlns:m="http://schemas.openxmlformats.org/officeDocument/2006/math" xmlns:v="urn:schemas-microsoft-com:vml" xmlns:wp14="http://schemas.microsoft.com/office/word/2010/wordprocessingDrawing" xmlns:wp="http://schemas.openxmlformats.org/drawingml/2006/wordprocessingDrawing" xmlns:w10="urn:schemas-microsoft-com:office:word" xmlns:w="http://schemas.openxmlformats.org/wordprocessingml/2006/main" xmlns:w14="http://schemas.microsoft.com/office/word/2010/wordml" xmlns:w15="http://schemas.microsoft.com/office/word/2012/wordml" xmlns:w16cex="http://schemas.microsoft.com/office/word/2018/wordml/cex" xmlns:w16cid="http://schemas.microsoft.com/office/word/2016/wordml/cid" xmlns:w16="http://schemas.microsoft.com/office/word/2018/wordml" xmlns:w16se="http://schemas.microsoft.com/office/word/2015/wordml/symex" xmlns:wpg="http://schemas.microsoft.com/office/word/2010/wordprocessingGroup" xmlns:wpi="http://schemas.microsoft.com/office/word/2010/wordprocessingInk" xmlns:wne="http://schemas.microsoft.com/office/word/2006/wordml" xmlns:wps="http://schemas.microsoft.com/office/word/2010/wordprocessingShape" mc:Ignorable="w14 w15 w16se w16cid w16 w16cex wp14">
   <w:body>
     <w:p>
       <w:pPr>
@@ -75,6 +75,7 @@
                 <w:rStyle w:val="lev"/>
               </w:rPr>
             </w:pPr>
+            <w:proofErr w:type="gramStart"/>
             <w:r>
               <w:rPr>
                 <w:rStyle w:val="lev"/>
@@ -87,6 +88,7 @@
               </w:rPr>
               <w:t>ROJET:</w:t>
             </w:r>
+            <w:proofErr w:type="gramEnd"/>
           </w:p>
         </w:tc>
         <w:tc>
@@ -95,13 +97,11 @@
             <w:gridSpan w:val="4"/>
           </w:tcPr>
           <w:p>
-            <w:proofErr w:type="spellStart"/>
-            <w:r>
-              <w:t>Nnn</w:t>
-            </w:r>
-            <w:proofErr w:type="spellEnd"/>
-            <w:r>
-              <w:t xml:space="preserve"> – Nom projet</w:t>
+            <w:r>
+              <w:t>2113-</w:t>
+            </w:r>
+            <w:r>
+              <w:t>D-sElectronique</w:t>
             </w:r>
           </w:p>
         </w:tc>
@@ -122,8 +122,16 @@
               <w:rPr>
                 <w:rStyle w:val="lev"/>
               </w:rPr>
-              <w:t>Entreprise/Client:</w:t>
-            </w:r>
+              <w:t>Entreprise/</w:t>
+            </w:r>
+            <w:proofErr w:type="gramStart"/>
+            <w:r>
+              <w:rPr>
+                <w:rStyle w:val="lev"/>
+              </w:rPr>
+              <w:t>Client:</w:t>
+            </w:r>
+            <w:proofErr w:type="gramEnd"/>
           </w:p>
         </w:tc>
         <w:tc>
@@ -132,7 +140,7 @@
           </w:tcPr>
           <w:p>
             <w:r>
-              <w:t>-</w:t>
+              <w:t>ETML-ES</w:t>
             </w:r>
           </w:p>
         </w:tc>
@@ -147,12 +155,14 @@
                 <w:b/>
               </w:rPr>
             </w:pPr>
+            <w:proofErr w:type="gramStart"/>
             <w:r>
               <w:rPr>
                 <w:b/>
               </w:rPr>
               <w:t>Département:</w:t>
             </w:r>
+            <w:proofErr w:type="gramEnd"/>
           </w:p>
         </w:tc>
         <w:tc>
@@ -187,7 +197,14 @@
               <w:rPr>
                 <w:rStyle w:val="lev"/>
               </w:rPr>
-              <w:t>Demandé par (Prénom, Nom)</w:t>
+              <w:t>Demandé par (Prénom, Nom</w:t>
+            </w:r>
+            <w:proofErr w:type="gramStart"/>
+            <w:r>
+              <w:rPr>
+                <w:rStyle w:val="lev"/>
+              </w:rPr>
+              <w:t>)</w:t>
             </w:r>
             <w:r>
               <w:rPr>
@@ -195,19 +212,14 @@
               </w:rPr>
               <w:t>:</w:t>
             </w:r>
+            <w:proofErr w:type="gramEnd"/>
           </w:p>
         </w:tc>
         <w:tc>
           <w:tcPr>
             <w:tcW w:w="2977" w:type="dxa"/>
           </w:tcPr>
-          <w:p>
-            <w:proofErr w:type="gramStart"/>
-            <w:r>
-              <w:t>mandataire</w:t>
-            </w:r>
-            <w:proofErr w:type="gramEnd"/>
-          </w:p>
+          <w:p/>
         </w:tc>
         <w:tc>
           <w:tcPr>
@@ -329,8 +341,16 @@
               <w:rPr>
                 <w:rStyle w:val="lev"/>
               </w:rPr>
-              <w:t xml:space="preserve"> à modifier:</w:t>
-            </w:r>
+              <w:t xml:space="preserve"> à </w:t>
+            </w:r>
+            <w:proofErr w:type="gramStart"/>
+            <w:r>
+              <w:rPr>
+                <w:rStyle w:val="lev"/>
+              </w:rPr>
+              <w:t>modifier:</w:t>
+            </w:r>
+            <w:proofErr w:type="gramEnd"/>
           </w:p>
         </w:tc>
         <w:tc>
@@ -339,13 +359,12 @@
             <w:gridSpan w:val="3"/>
           </w:tcPr>
           <w:p>
-            <w:proofErr w:type="spellStart"/>
-            <w:proofErr w:type="gramStart"/>
-            <w:r>
-              <w:t>Vx.y</w:t>
-            </w:r>
-            <w:proofErr w:type="spellEnd"/>
-            <w:proofErr w:type="gramEnd"/>
+            <w:r>
+              <w:t>V</w:t>
+            </w:r>
+            <w:r>
+              <w:t>2.X</w:t>
+            </w:r>
           </w:p>
         </w:tc>
       </w:tr>
@@ -377,6 +396,9 @@
         <w:gridCol w:w="1455"/>
       </w:tblGrid>
       <w:tr>
+        <w:trPr>
+          <w:trHeight w:val="231"/>
+        </w:trPr>
         <w:tc>
           <w:tcPr>
             <w:tcW w:w="3085" w:type="dxa"/>
@@ -392,8 +414,16 @@
               <w:rPr>
                 <w:rStyle w:val="lev"/>
               </w:rPr>
-              <w:t>Auteur (ETML-ES):</w:t>
-            </w:r>
+              <w:t>Auteur (ETML-ES</w:t>
+            </w:r>
+            <w:proofErr w:type="gramStart"/>
+            <w:r>
+              <w:rPr>
+                <w:rStyle w:val="lev"/>
+              </w:rPr>
+              <w:t>):</w:t>
+            </w:r>
+            <w:proofErr w:type="gramEnd"/>
           </w:p>
         </w:tc>
         <w:tc>
@@ -402,7 +432,7 @@
           </w:tcPr>
           <w:p>
             <w:r>
-              <w:t>Prénom Nom</w:t>
+              <w:t xml:space="preserve">Aymeric Clauzel </w:t>
             </w:r>
           </w:p>
         </w:tc>
@@ -454,8 +484,16 @@
               <w:rPr>
                 <w:rStyle w:val="lev"/>
               </w:rPr>
-              <w:t>Nouvelle version:</w:t>
-            </w:r>
+              <w:t xml:space="preserve">Nouvelle </w:t>
+            </w:r>
+            <w:proofErr w:type="gramStart"/>
+            <w:r>
+              <w:rPr>
+                <w:rStyle w:val="lev"/>
+              </w:rPr>
+              <w:t>version:</w:t>
+            </w:r>
+            <w:proofErr w:type="gramEnd"/>
           </w:p>
         </w:tc>
         <w:tc>
@@ -463,51 +501,17 @@
             <w:tcW w:w="3402" w:type="dxa"/>
           </w:tcPr>
           <w:p>
-            <w:proofErr w:type="spellStart"/>
-            <w:proofErr w:type="gramStart"/>
             <w:r>
               <w:t>V</w:t>
             </w:r>
             <w:r>
-              <w:t>x.y</w:t>
-            </w:r>
-            <w:proofErr w:type="spellEnd"/>
-            <w:proofErr w:type="gramEnd"/>
+              <w:t>3</w:t>
+            </w:r>
             <w:r>
               <w:t xml:space="preserve"> </w:t>
             </w:r>
           </w:p>
-          <w:p>
-            <w:pPr>
-              <w:rPr>
-                <w:i/>
-                <w:iCs/>
-              </w:rPr>
-            </w:pPr>
-            <w:r>
-              <w:rPr>
-                <w:i/>
-                <w:iCs/>
-              </w:rPr>
-              <w:t>Incrémenter no majeur x</w:t>
-            </w:r>
-            <w:r>
-              <w:rPr>
-                <w:i/>
-                <w:iCs/>
-              </w:rPr>
-              <w:t>+1</w:t>
-            </w:r>
-          </w:p>
-          <w:p>
-            <w:r>
-              <w:rPr>
-                <w:i/>
-                <w:iCs/>
-              </w:rPr>
-              <w:t>Et ou no mineur y+1</w:t>
-            </w:r>
-          </w:p>
+          <w:p/>
         </w:tc>
         <w:tc>
           <w:tcPr>
@@ -536,25 +540,7 @@
           </w:tcPr>
           <w:p>
             <w:r>
-              <w:t>20</w:t>
-            </w:r>
-            <w:r>
-              <w:t>.</w:t>
-            </w:r>
-            <w:r>
-              <w:t>0</w:t>
-            </w:r>
-            <w:r>
-              <w:t>2</w:t>
-            </w:r>
-            <w:r>
-              <w:t>.20</w:t>
-            </w:r>
-            <w:r>
-              <w:t>2</w:t>
-            </w:r>
-            <w:r>
-              <w:t>4</w:t>
+              <w:t>03.02.2025</w:t>
             </w:r>
           </w:p>
         </w:tc>
@@ -580,106 +566,29 @@
       </w:r>
     </w:p>
     <w:p>
-      <w:pPr>
-        <w:rPr>
-          <w:i/>
-          <w:iCs/>
-        </w:rPr>
-      </w:pPr>
-      <w:r>
-        <w:rPr>
-          <w:i/>
-          <w:iCs/>
-        </w:rPr>
-        <w:t xml:space="preserve">En </w:t>
-      </w:r>
-      <w:r>
-        <w:rPr>
-          <w:i/>
-          <w:iCs/>
-        </w:rPr>
-        <w:t>quelques</w:t>
-      </w:r>
-      <w:r>
-        <w:rPr>
-          <w:i/>
-          <w:iCs/>
-        </w:rPr>
-        <w:t xml:space="preserve"> phrases, que fait</w:t>
-      </w:r>
-      <w:r>
-        <w:rPr>
-          <w:i/>
-          <w:iCs/>
-        </w:rPr>
-        <w:t xml:space="preserve"> le projet ? Fonctions principales ?</w:t>
+      <w:r>
+        <w:t>Il s’agit de réaliser un dé électronique qui puisse être produit en petite série à l’ETML et distribué aux visiteurs de l’ES, par exemple lors des portes ouvertes. S’agissant d’un cadeau, une attention particulière sera portée à la minimalisation des coûts. Le fonctionnement sera le suivant :</w:t>
       </w:r>
     </w:p>
     <w:p>
-      <w:pPr>
-        <w:pStyle w:val="Titre2"/>
-      </w:pPr>
-      <w:r>
-        <w:t>Référence conception</w:t>
+      <w:r>
+        <w:t xml:space="preserve">Lorsque le montage est secoué puis reposé à l’horizontale, un nombre aléatoire entre 1 et 6 sera affiché à l’aide de 7 </w:t>
+      </w:r>
+      <w:proofErr w:type="spellStart"/>
+      <w:r>
+        <w:t>LEDs</w:t>
+      </w:r>
+      <w:proofErr w:type="spellEnd"/>
+      <w:r>
+        <w:t>. Il ne doit y avoir aucun bouton. Les LED seront disposées à la manière d’un dé à lancer. Les LED restent allumées 10 secondes, puis le montage s’éteint (coupure d’alimentation totale, sauf pour l’élément de détection du secouement). Ce dernier est le seul sous tension en permanence et réveille le montage à chaque nouveau secouement.</w:t>
       </w:r>
     </w:p>
     <w:p>
       <w:pPr>
-        <w:rPr>
-          <w:i/>
-        </w:rPr>
-      </w:pPr>
-      <w:r>
-        <w:rPr>
-          <w:i/>
-        </w:rPr>
-        <w:t>Disponibles dans le dossier du projet </w:t>
-      </w:r>
-      <w:r>
-        <w:rPr>
-          <w:i/>
-        </w:rPr>
-        <w:t xml:space="preserve">(rapport, </w:t>
-      </w:r>
-      <w:proofErr w:type="spellStart"/>
-      <w:r>
-        <w:rPr>
-          <w:i/>
-        </w:rPr>
-        <w:t>cdc</w:t>
-      </w:r>
-      <w:proofErr w:type="spellEnd"/>
-      <w:r>
-        <w:rPr>
-          <w:i/>
-        </w:rPr>
-        <w:t>…</w:t>
-      </w:r>
-      <w:proofErr w:type="gramStart"/>
-      <w:r>
-        <w:rPr>
-          <w:i/>
-        </w:rPr>
-        <w:t>)</w:t>
-      </w:r>
-      <w:r>
-        <w:rPr>
-          <w:i/>
-        </w:rPr>
-        <w:t>:</w:t>
-      </w:r>
-      <w:proofErr w:type="gramEnd"/>
-      <w:r>
-        <w:rPr>
-          <w:i/>
-        </w:rPr>
-        <w:br/>
-      </w:r>
-      <w:r>
-        <w:rPr>
-          <w:i/>
-        </w:rPr>
-        <w:t>K:\ES\PROJETS\SLO\2203_BootloaderPic32\doc</w:t>
+        <w:pStyle w:val="Titre2"/>
+      </w:pPr>
+      <w:r>
+        <w:t>Référence conception</w:t>
       </w:r>
     </w:p>
     <w:p>
@@ -688,6 +597,58 @@
           <w:i/>
         </w:rPr>
       </w:pPr>
+      <w:r>
+        <w:rPr>
+          <w:i/>
+        </w:rPr>
+        <w:t>Disponibles dans le dossier du projet </w:t>
+      </w:r>
+      <w:r>
+        <w:rPr>
+          <w:i/>
+        </w:rPr>
+        <w:t xml:space="preserve">(rapport, </w:t>
+      </w:r>
+      <w:proofErr w:type="spellStart"/>
+      <w:r>
+        <w:rPr>
+          <w:i/>
+        </w:rPr>
+        <w:t>cdc</w:t>
+      </w:r>
+      <w:proofErr w:type="spellEnd"/>
+      <w:r>
+        <w:rPr>
+          <w:i/>
+        </w:rPr>
+        <w:t>…</w:t>
+      </w:r>
+      <w:proofErr w:type="gramStart"/>
+      <w:r>
+        <w:rPr>
+          <w:i/>
+        </w:rPr>
+        <w:t>)</w:t>
+      </w:r>
+      <w:r>
+        <w:rPr>
+          <w:i/>
+        </w:rPr>
+        <w:t>:</w:t>
+      </w:r>
+      <w:proofErr w:type="gramEnd"/>
+      <w:r>
+        <w:rPr>
+          <w:i/>
+        </w:rPr>
+        <w:br/>
+      </w:r>
+      <w:r>
+        <w:rPr>
+          <w:i/>
+        </w:rPr>
+        <w:t>K:\ES\PROJETS\SLO\2113_DeElectronique</w:t>
+      </w:r>
     </w:p>
     <w:p>
       <w:pPr>
@@ -712,102 +673,132 @@
           <w:i/>
           <w:iCs/>
         </w:rPr>
-        <w:t>Pourquoi modifie-t-on ce projet</w:t>
-      </w:r>
+        <w:t xml:space="preserve">L’objectif principale est de faire en sorte qu’à chaque secouement les </w:t>
+      </w:r>
+      <w:proofErr w:type="spellStart"/>
       <w:r>
         <w:rPr>
           <w:i/>
           <w:iCs/>
         </w:rPr>
-        <w:t>, quelles fonctionnalités veut-on ajouter ou modifier</w:t>
-      </w:r>
+        <w:t>leds</w:t>
+      </w:r>
+      <w:proofErr w:type="spellEnd"/>
       <w:r>
         <w:rPr>
           <w:i/>
           <w:iCs/>
         </w:rPr>
-        <w:t xml:space="preserve"> (quelques phrases)</w:t>
-      </w:r>
-    </w:p>
-    <w:p/>
-    <w:p>
-      <w:pPr>
-        <w:pStyle w:val="Titre1"/>
-      </w:pPr>
-      <w:r>
-        <w:t>Résumé de l’état actuel</w:t>
+        <w:t xml:space="preserve"> s’allument pendant 10 secondes avant de s’éteindre. Un nouveau secouement doit redéclencher le roll du dé</w:t>
+      </w:r>
+      <w:r>
+        <w:rPr>
+          <w:i/>
+          <w:iCs/>
+        </w:rPr>
+        <w:t xml:space="preserve">, </w:t>
+      </w:r>
+      <w:proofErr w:type="spellStart"/>
+      <w:r>
+        <w:rPr>
+          <w:i/>
+          <w:iCs/>
+        </w:rPr>
+        <w:t>peut</w:t>
+      </w:r>
+      <w:proofErr w:type="spellEnd"/>
+      <w:r>
+        <w:rPr>
+          <w:i/>
+          <w:iCs/>
+        </w:rPr>
+        <w:t xml:space="preserve"> </w:t>
+      </w:r>
+      <w:proofErr w:type="spellStart"/>
+      <w:r>
+        <w:rPr>
+          <w:i/>
+          <w:iCs/>
+        </w:rPr>
+        <w:t>importe</w:t>
+      </w:r>
+      <w:proofErr w:type="spellEnd"/>
+      <w:r>
+        <w:rPr>
+          <w:i/>
+          <w:iCs/>
+        </w:rPr>
+        <w:t xml:space="preserve"> la force ou le temps</w:t>
+      </w:r>
+      <w:r>
+        <w:rPr>
+          <w:i/>
+          <w:iCs/>
+        </w:rPr>
+        <w:t>. L’extinction totale du système se fait en retirant la pille.</w:t>
       </w:r>
     </w:p>
     <w:p>
       <w:pPr>
-        <w:rPr>
-          <w:i/>
-          <w:iCs/>
-        </w:rPr>
-      </w:pPr>
-      <w:r>
-        <w:rPr>
-          <w:i/>
-          <w:iCs/>
-          <w:shd w:val="clear" w:color="auto" w:fill="FFFFFF"/>
-        </w:rPr>
-        <w:t xml:space="preserve">Description générale de l’état et du fonctionnement </w:t>
-      </w:r>
-      <w:r>
-        <w:rPr>
-          <w:i/>
-          <w:iCs/>
-          <w:shd w:val="clear" w:color="auto" w:fill="FFFFFF"/>
-        </w:rPr>
-        <w:t>actuel</w:t>
-      </w:r>
-      <w:r>
-        <w:rPr>
-          <w:i/>
-          <w:iCs/>
-          <w:shd w:val="clear" w:color="auto" w:fill="FFFFFF"/>
-        </w:rPr>
-        <w:t>s</w:t>
-      </w:r>
-      <w:r>
-        <w:rPr>
-          <w:i/>
-          <w:iCs/>
-          <w:shd w:val="clear" w:color="auto" w:fill="FFFFFF"/>
-        </w:rPr>
-        <w:t xml:space="preserve"> </w:t>
-      </w:r>
-      <w:r>
-        <w:rPr>
-          <w:i/>
-          <w:iCs/>
-          <w:shd w:val="clear" w:color="auto" w:fill="FFFFFF"/>
-        </w:rPr>
-        <w:t xml:space="preserve">avant </w:t>
-      </w:r>
-      <w:r>
-        <w:rPr>
-          <w:i/>
-          <w:iCs/>
-          <w:shd w:val="clear" w:color="auto" w:fill="FFFFFF"/>
-        </w:rPr>
-        <w:t>modifications</w:t>
-      </w:r>
-      <w:r>
-        <w:rPr>
-          <w:i/>
-          <w:iCs/>
-          <w:shd w:val="clear" w:color="auto" w:fill="FFFFFF"/>
-        </w:rPr>
-        <w:t>.</w:t>
+        <w:pStyle w:val="Titre1"/>
+      </w:pPr>
+      <w:r>
+        <w:t>Résumé de l’état actuel</w:t>
       </w:r>
     </w:p>
     <w:p>
-      <w:r>
-        <w:br w:type="page"/>
+      <w:pPr>
+        <w:rPr>
+          <w:i/>
+          <w:iCs/>
+        </w:rPr>
+      </w:pPr>
+      <w:r>
+        <w:rPr>
+          <w:i/>
+          <w:iCs/>
+        </w:rPr>
+        <w:t xml:space="preserve">Actuellement l’allumage des LEDS ne correspond pas à la demande du </w:t>
+      </w:r>
+      <w:proofErr w:type="spellStart"/>
+      <w:r>
+        <w:rPr>
+          <w:i/>
+          <w:iCs/>
+        </w:rPr>
+        <w:t>cdc</w:t>
+      </w:r>
+      <w:proofErr w:type="spellEnd"/>
+      <w:r>
+        <w:rPr>
+          <w:i/>
+          <w:iCs/>
+        </w:rPr>
+        <w:t xml:space="preserve">, parfois elles ne s’allument pas. Parfois il faut secouer pendant longtemps avant que les </w:t>
+      </w:r>
+      <w:proofErr w:type="spellStart"/>
+      <w:r>
+        <w:rPr>
+          <w:i/>
+          <w:iCs/>
+        </w:rPr>
+        <w:t>leds</w:t>
+      </w:r>
+      <w:proofErr w:type="spellEnd"/>
+      <w:r>
+        <w:rPr>
+          <w:i/>
+          <w:iCs/>
+        </w:rPr>
+        <w:t xml:space="preserve"> s’allument.</w:t>
       </w:r>
     </w:p>
     <w:p>
+      <w:r>
+        <w:br w:type="page"/>
+      </w:r>
+    </w:p>
+    <w:p>
       <w:pPr>
         <w:pStyle w:val="Titre1"/>
       </w:pPr>
@@ -831,88 +822,110 @@
           <w:iCs/>
         </w:rPr>
       </w:pPr>
+      <w:proofErr w:type="spellStart"/>
       <w:r>
         <w:rPr>
           <w:i/>
           <w:iCs/>
         </w:rPr>
-        <w:t xml:space="preserve">Quel est </w:t>
-      </w:r>
+        <w:t>Firmware</w:t>
+      </w:r>
+      <w:proofErr w:type="spellEnd"/>
       <w:r>
         <w:rPr>
           <w:i/>
           <w:iCs/>
         </w:rPr>
-        <w:t>le</w:t>
+        <w:t xml:space="preserve"> ou software qui réalise la ou </w:t>
       </w:r>
       <w:r>
         <w:rPr>
           <w:i/>
           <w:iCs/>
         </w:rPr>
-        <w:t xml:space="preserve"> résultat tangible </w:t>
+        <w:t>les fonctions demandées</w:t>
       </w:r>
       <w:r>
         <w:rPr>
           <w:i/>
           <w:iCs/>
         </w:rPr>
-        <w:t>de la</w:t>
+        <w:t xml:space="preserve"> par le CDC, dans sa version</w:t>
       </w:r>
       <w:r>
         <w:rPr>
           <w:i/>
           <w:iCs/>
         </w:rPr>
-        <w:t xml:space="preserve"> production réelle, appréhendable, mesurable</w:t>
+        <w:t xml:space="preserve"> 3</w:t>
       </w:r>
       <w:r>
         <w:rPr>
           <w:i/>
           <w:iCs/>
         </w:rPr>
-        <w:t xml:space="preserve"> que vous allez réaliser</w:t>
+        <w:t>.</w:t>
       </w:r>
       <w:r>
         <w:rPr>
           <w:i/>
           <w:iCs/>
         </w:rPr>
-        <w:t xml:space="preserve"> (implique </w:t>
-      </w:r>
+        <w:t xml:space="preserve"> </w:t>
+      </w:r>
+      <w:proofErr w:type="spellStart"/>
+      <w:proofErr w:type="gramStart"/>
       <w:r>
         <w:rPr>
           <w:i/>
           <w:iCs/>
         </w:rPr>
-        <w:t>la conception, le codage</w:t>
-      </w:r>
+        <w:t>structogramme</w:t>
+      </w:r>
+      <w:proofErr w:type="spellEnd"/>
+      <w:proofErr w:type="gramEnd"/>
       <w:r>
         <w:rPr>
           <w:i/>
           <w:iCs/>
         </w:rPr>
-        <w:t xml:space="preserve"> selon </w:t>
+        <w:t xml:space="preserve"> / flow chart du fonctionnement principal. </w:t>
       </w:r>
       <w:r>
         <w:rPr>
           <w:i/>
           <w:iCs/>
         </w:rPr>
-        <w:t>le standard ETM-ES</w:t>
+        <w:br/>
       </w:r>
       <w:r>
         <w:rPr>
           <w:i/>
           <w:iCs/>
         </w:rPr>
-        <w:t xml:space="preserve"> et les tests</w:t>
-      </w:r>
+        <w:t>Flow chart/détails des fonctions sous formes de diagrammes de flux/</w:t>
+      </w:r>
+      <w:proofErr w:type="spellStart"/>
       <w:r>
         <w:rPr>
           <w:i/>
           <w:iCs/>
         </w:rPr>
+        <w:t>structo</w:t>
+      </w:r>
+      <w:proofErr w:type="spellEnd"/>
+      <w:r>
+        <w:rPr>
+          <w:i/>
+          <w:iCs/>
+        </w:rPr>
+        <w:t>.</w:t>
+      </w:r>
+      <w:r>
+        <w:rPr>
+          <w:i/>
+          <w:iCs/>
+        </w:rPr>
         <w:t xml:space="preserve"> </w:t>
       </w:r>
       <w:r>
@@ -920,221 +933,58 @@
           <w:i/>
           <w:iCs/>
         </w:rPr>
-        <w:t>et comparaison avec</w:t>
-      </w:r>
-      <w:r>
-        <w:rPr>
-          <w:i/>
-          <w:iCs/>
-        </w:rPr>
-        <w:t xml:space="preserve"> version</w:t>
-      </w:r>
-      <w:r>
-        <w:rPr>
-          <w:i/>
-          <w:iCs/>
-        </w:rPr>
-        <w:t xml:space="preserve"> précédente</w:t>
-      </w:r>
-      <w:r>
-        <w:rPr>
-          <w:i/>
-          <w:iCs/>
-        </w:rPr>
-        <w:t>)</w:t>
+        <w:br/>
       </w:r>
     </w:p>
     <w:p>
       <w:pPr>
-        <w:rPr>
-          <w:i/>
-          <w:iCs/>
-        </w:rPr>
-      </w:pPr>
-      <w:r>
-        <w:rPr>
-          <w:i/>
-          <w:iCs/>
-        </w:rPr>
-        <w:t xml:space="preserve">Exemple : </w:t>
+        <w:pStyle w:val="Titre2"/>
+      </w:pPr>
+      <w:r>
+        <w:t xml:space="preserve">Archivage sur </w:t>
       </w:r>
       <w:proofErr w:type="spellStart"/>
       <w:r>
-        <w:rPr>
-          <w:i/>
-          <w:iCs/>
-        </w:rPr>
-        <w:t>Firmware</w:t>
+        <w:t>Github</w:t>
       </w:r>
       <w:proofErr w:type="spellEnd"/>
       <w:r>
-        <w:rPr>
-          <w:i/>
-          <w:iCs/>
-        </w:rPr>
-        <w:t xml:space="preserve"> ou software</w:t>
-      </w:r>
-      <w:r>
-        <w:rPr>
-          <w:i/>
-          <w:iCs/>
-        </w:rPr>
-        <w:t xml:space="preserve"> qui réalise </w:t>
-      </w:r>
-      <w:r>
-        <w:rPr>
-          <w:i/>
-          <w:iCs/>
-        </w:rPr>
-        <w:t>la ou les fonctions</w:t>
-      </w:r>
-      <w:proofErr w:type="gramStart"/>
-      <w:r>
-        <w:rPr>
-          <w:i/>
-          <w:iCs/>
-        </w:rPr>
-        <w:t xml:space="preserve"> ….</w:t>
-      </w:r>
-      <w:proofErr w:type="gramEnd"/>
-      <w:r>
-        <w:rPr>
-          <w:i/>
-          <w:iCs/>
-        </w:rPr>
-        <w:t xml:space="preserve">, avec le numéro de la nouvelle version et </w:t>
-      </w:r>
-      <w:r>
-        <w:rPr>
-          <w:i/>
-          <w:iCs/>
-        </w:rPr>
-        <w:t xml:space="preserve">la documentation </w:t>
-      </w:r>
-      <w:r>
-        <w:rPr>
-          <w:i/>
-          <w:iCs/>
-        </w:rPr>
-        <w:t>(</w:t>
-      </w:r>
-      <w:proofErr w:type="spellStart"/>
-      <w:r>
-        <w:rPr>
-          <w:i/>
-          <w:iCs/>
-        </w:rPr>
-        <w:t>struc</w:t>
-      </w:r>
-      <w:r>
-        <w:rPr>
-          <w:i/>
-          <w:iCs/>
-        </w:rPr>
-        <w:t>to</w:t>
-      </w:r>
-      <w:proofErr w:type="spellEnd"/>
-      <w:r>
-        <w:rPr>
-          <w:i/>
-          <w:iCs/>
-        </w:rPr>
-        <w:t xml:space="preserve">, pseudocode, </w:t>
-      </w:r>
-      <w:r>
-        <w:rPr>
-          <w:i/>
-          <w:iCs/>
-        </w:rPr>
-        <w:t>machines d’état)</w:t>
-      </w:r>
-      <w:r>
-        <w:rPr>
-          <w:i/>
-          <w:iCs/>
-        </w:rPr>
-        <w:t xml:space="preserve"> et les</w:t>
-      </w:r>
-      <w:r>
-        <w:rPr>
-          <w:i/>
-          <w:iCs/>
-        </w:rPr>
-        <w:t xml:space="preserve"> </w:t>
-      </w:r>
-      <w:r>
-        <w:rPr>
-          <w:i/>
-          <w:iCs/>
-        </w:rPr>
-        <w:t>r</w:t>
-      </w:r>
-      <w:r>
-        <w:rPr>
-          <w:i/>
-          <w:iCs/>
-        </w:rPr>
-        <w:t>ésultat des tests</w:t>
-      </w:r>
-      <w:r>
-        <w:rPr>
-          <w:i/>
-          <w:iCs/>
-        </w:rPr>
-        <w:t>.</w:t>
+        <w:t xml:space="preserve"> (optionnel)</w:t>
       </w:r>
     </w:p>
     <w:p>
       <w:pPr>
-        <w:pStyle w:val="Titre2"/>
-      </w:pPr>
-      <w:r>
-        <w:t xml:space="preserve">Archivage sur </w:t>
-      </w:r>
-      <w:proofErr w:type="spellStart"/>
-      <w:r>
-        <w:t>Github</w:t>
-      </w:r>
-      <w:proofErr w:type="spellEnd"/>
-      <w:r>
-        <w:t xml:space="preserve"> (optionnel)</w:t>
+        <w:rPr>
+          <w:i/>
+          <w:iCs/>
+        </w:rPr>
+      </w:pPr>
+      <w:r>
+        <w:rPr>
+          <w:i/>
+          <w:iCs/>
+        </w:rPr>
+        <w:t xml:space="preserve">Le projet est archivé </w:t>
+      </w:r>
+      <w:r>
+        <w:rPr>
+          <w:i/>
+          <w:iCs/>
+        </w:rPr>
+        <w:t>sur Git selon accord avec le mandant</w:t>
       </w:r>
     </w:p>
     <w:p>
       <w:pPr>
         <w:rPr>
           <w:i/>
-          <w:iCs/>
-        </w:rPr>
-      </w:pPr>
-      <w:r>
-        <w:rPr>
-          <w:i/>
-          <w:iCs/>
-        </w:rPr>
-        <w:t xml:space="preserve">Le projet est archivé </w:t>
-      </w:r>
-      <w:r>
-        <w:rPr>
-          <w:i/>
-          <w:iCs/>
-        </w:rPr>
-        <w:t>sur Git selon accord avec le mandant</w:t>
-      </w:r>
-    </w:p>
-    <w:p>
-      <w:pPr>
-        <w:rPr>
-          <w:i/>
-          <w:iCs/>
-        </w:rPr>
-      </w:pPr>
-      <w:r>
-        <w:rPr>
-          <w:i/>
-          <w:iCs/>
-        </w:rPr>
-        <w:t>Insérer le lien sur l’archive</w:t>
+        </w:rPr>
+      </w:pPr>
+      <w:r>
+        <w:rPr>
+          <w:i/>
+        </w:rPr>
+        <w:t>https://github.com/ETML-ES-SLO/PRJ_2113_D-sElectronique</w:t>
       </w:r>
     </w:p>
     <w:p>
@@ -1336,7 +1186,7 @@
               <w:rPr>
                 <w:rStyle w:val="lev"/>
               </w:rPr>
-              <w:t>1</w:t>
+              <w:t>3</w:t>
             </w:r>
           </w:p>
         </w:tc>
@@ -1351,14 +1201,12 @@
             <w:r>
               <w:t>Lire le rapport effectué par</w:t>
             </w:r>
-            <w:proofErr w:type="gramStart"/>
             <w:r>
               <w:t xml:space="preserve"> </w:t>
             </w:r>
             <w:r>
-              <w:t>….</w:t>
-            </w:r>
-            <w:proofErr w:type="gramEnd"/>
+              <w:t>MAXIME COLLOUD</w:t>
+            </w:r>
           </w:p>
         </w:tc>
         <w:tc>
@@ -1369,9 +1217,6 @@
             <w:pPr>
               <w:jc w:val="center"/>
             </w:pPr>
-            <w:r>
-              <w:t>CFO</w:t>
-            </w:r>
           </w:p>
         </w:tc>
         <w:tc>
@@ -1382,9 +1227,6 @@
             <w:pPr>
               <w:jc w:val="center"/>
             </w:pPr>
-            <w:r>
-              <w:t>OK</w:t>
-            </w:r>
           </w:p>
         </w:tc>
       </w:tr>
@@ -1423,7 +1265,7 @@
               <w:rPr>
                 <w:rStyle w:val="lev"/>
               </w:rPr>
-              <w:t>1</w:t>
+              <w:t>2</w:t>
             </w:r>
           </w:p>
         </w:tc>
@@ -1436,19 +1278,13 @@
               <w:jc w:val="both"/>
             </w:pPr>
             <w:r>
-              <w:t>Lire le datasheet sur</w:t>
-            </w:r>
-            <w:proofErr w:type="gramStart"/>
-            <w:r>
-              <w:t xml:space="preserve"> </w:t>
-            </w:r>
-            <w:r>
-              <w:t>…</w:t>
-            </w:r>
-            <w:r>
-              <w:t>.</w:t>
-            </w:r>
-            <w:proofErr w:type="gramEnd"/>
+              <w:t xml:space="preserve">Créer un nouveau projet dans l’environnement </w:t>
+            </w:r>
+            <w:proofErr w:type="spellStart"/>
+            <w:r>
+              <w:t>Mplab</w:t>
+            </w:r>
+            <w:proofErr w:type="spellEnd"/>
           </w:p>
         </w:tc>
         <w:tc>
@@ -1469,9 +1305,6 @@
             <w:pPr>
               <w:jc w:val="center"/>
             </w:pPr>
-            <w:r>
-              <w:t>OK</w:t>
-            </w:r>
           </w:p>
         </w:tc>
       </w:tr>
@@ -1491,7 +1324,7 @@
               <w:rPr>
                 <w:rStyle w:val="lev"/>
               </w:rPr>
-              <w:t>4</w:t>
+              <w:t>3</w:t>
             </w:r>
           </w:p>
         </w:tc>
@@ -1510,7 +1343,7 @@
               <w:rPr>
                 <w:rStyle w:val="lev"/>
               </w:rPr>
-              <w:t>1</w:t>
+              <w:t>2</w:t>
             </w:r>
           </w:p>
         </w:tc>
@@ -1523,13 +1356,10 @@
               <w:jc w:val="both"/>
             </w:pPr>
             <w:r>
-              <w:t xml:space="preserve">Créer un nouveau projet </w:t>
-            </w:r>
-            <w:r>
-              <w:t xml:space="preserve">dans l’environnement </w:t>
-            </w:r>
-            <w:r>
-              <w:t>xxx</w:t>
+              <w:t>Tester</w:t>
+            </w:r>
+            <w:r>
+              <w:t xml:space="preserve"> le fonctionnement actuel</w:t>
             </w:r>
           </w:p>
         </w:tc>
@@ -1570,7 +1400,7 @@
               <w:rPr>
                 <w:rStyle w:val="lev"/>
               </w:rPr>
-              <w:t>5</w:t>
+              <w:t>4</w:t>
             </w:r>
           </w:p>
         </w:tc>
@@ -1602,7 +1432,7 @@
               <w:jc w:val="both"/>
             </w:pPr>
             <w:r>
-              <w:t>Tester …</w:t>
+              <w:t xml:space="preserve">Faire le descriptif détaillé avec lien correspondant au soft actuel </w:t>
             </w:r>
           </w:p>
         </w:tc>
@@ -1643,7 +1473,7 @@
               <w:rPr>
                 <w:rStyle w:val="lev"/>
               </w:rPr>
-              <w:t>6</w:t>
+              <w:t>5</w:t>
             </w:r>
           </w:p>
         </w:tc>
@@ -1662,7 +1492,7 @@
               <w:rPr>
                 <w:rStyle w:val="lev"/>
               </w:rPr>
-              <w:t>2</w:t>
+              <w:t>1</w:t>
             </w:r>
           </w:p>
         </w:tc>
@@ -1675,22 +1505,8 @@
               <w:jc w:val="both"/>
             </w:pPr>
             <w:r>
-              <w:t>Conception de</w:t>
-            </w:r>
-            <w:r>
-              <w:t xml:space="preserve"> </w:t>
-            </w:r>
-            <w:proofErr w:type="gramStart"/>
-            <w:r>
-              <w:t>l’architecture</w:t>
-            </w:r>
-            <w:r>
-              <w:t>…</w:t>
-            </w:r>
-            <w:r>
-              <w:t>.</w:t>
-            </w:r>
-            <w:proofErr w:type="gramEnd"/>
+              <w:t>Maitrise des registres de configuration accéléromètre</w:t>
+            </w:r>
           </w:p>
         </w:tc>
         <w:tc>
@@ -1730,7 +1546,7 @@
               <w:rPr>
                 <w:rStyle w:val="lev"/>
               </w:rPr>
-              <w:t>7</w:t>
+              <w:t>6</w:t>
             </w:r>
           </w:p>
         </w:tc>
@@ -1749,7 +1565,7 @@
               <w:rPr>
                 <w:rStyle w:val="lev"/>
               </w:rPr>
-              <w:t>2</w:t>
+              <w:t>1</w:t>
             </w:r>
           </w:p>
         </w:tc>
@@ -1762,27 +1578,13 @@
               <w:jc w:val="both"/>
             </w:pPr>
             <w:r>
-              <w:t xml:space="preserve">Réaliser la partie </w:t>
+              <w:t xml:space="preserve">Test de gestion de l’interruption de </w:t>
             </w:r>
             <w:proofErr w:type="spellStart"/>
             <w:r>
-              <w:t>firmware</w:t>
+              <w:t>Wake-up</w:t>
             </w:r>
             <w:proofErr w:type="spellEnd"/>
-            <w:r>
-              <w:t xml:space="preserve"> qui</w:t>
-            </w:r>
-            <w:proofErr w:type="gramStart"/>
-            <w:r>
-              <w:t xml:space="preserve"> </w:t>
-            </w:r>
-            <w:r>
-              <w:t>…</w:t>
-            </w:r>
-            <w:r>
-              <w:t>.</w:t>
-            </w:r>
-            <w:proofErr w:type="gramEnd"/>
           </w:p>
         </w:tc>
         <w:tc>
@@ -1818,6 +1620,12 @@
                 <w:rStyle w:val="lev"/>
               </w:rPr>
             </w:pPr>
+            <w:r>
+              <w:rPr>
+                <w:rStyle w:val="lev"/>
+              </w:rPr>
+              <w:t>7</w:t>
+            </w:r>
           </w:p>
         </w:tc>
         <w:tc>
@@ -1831,6 +1639,12 @@
                 <w:rStyle w:val="lev"/>
               </w:rPr>
             </w:pPr>
+            <w:r>
+              <w:rPr>
+                <w:rStyle w:val="lev"/>
+              </w:rPr>
+              <w:t>1</w:t>
+            </w:r>
           </w:p>
         </w:tc>
         <w:tc>
@@ -1841,6 +1655,17 @@
             <w:pPr>
               <w:jc w:val="both"/>
             </w:pPr>
+            <w:r>
+              <w:t xml:space="preserve">Faire nouveau </w:t>
+            </w:r>
+            <w:proofErr w:type="spellStart"/>
+            <w:r>
+              <w:t>structo</w:t>
+            </w:r>
+            <w:proofErr w:type="spellEnd"/>
+            <w:r>
+              <w:t xml:space="preserve">/flow chart </w:t>
+            </w:r>
           </w:p>
         </w:tc>
         <w:tc>
@@ -1876,6 +1701,12 @@
                 <w:rStyle w:val="lev"/>
               </w:rPr>
             </w:pPr>
+            <w:r>
+              <w:rPr>
+                <w:rStyle w:val="lev"/>
+              </w:rPr>
+              <w:t>8</w:t>
+            </w:r>
           </w:p>
         </w:tc>
         <w:tc>
@@ -1889,6 +1720,12 @@
                 <w:rStyle w:val="lev"/>
               </w:rPr>
             </w:pPr>
+            <w:r>
+              <w:rPr>
+                <w:rStyle w:val="lev"/>
+              </w:rPr>
+              <w:t>1</w:t>
+            </w:r>
           </w:p>
         </w:tc>
         <w:tc>
@@ -1899,6 +1736,9 @@
             <w:pPr>
               <w:jc w:val="both"/>
             </w:pPr>
+            <w:r>
+              <w:t>Faire les modifications nécessaires du soft</w:t>
+            </w:r>
           </w:p>
         </w:tc>
         <w:tc>
@@ -1934,6 +1774,12 @@
                 <w:rStyle w:val="lev"/>
               </w:rPr>
             </w:pPr>
+            <w:r>
+              <w:rPr>
+                <w:rStyle w:val="lev"/>
+              </w:rPr>
+              <w:t>9</w:t>
+            </w:r>
           </w:p>
         </w:tc>
         <w:tc>
@@ -1947,6 +1793,12 @@
                 <w:rStyle w:val="lev"/>
               </w:rPr>
             </w:pPr>
+            <w:r>
+              <w:rPr>
+                <w:rStyle w:val="lev"/>
+              </w:rPr>
+              <w:t>1</w:t>
+            </w:r>
           </w:p>
         </w:tc>
         <w:tc>
@@ -1957,6 +1809,9 @@
             <w:pPr>
               <w:jc w:val="both"/>
             </w:pPr>
+            <w:r>
+              <w:t xml:space="preserve">Tester le fonctionnement final </w:t>
+            </w:r>
           </w:p>
         </w:tc>
         <w:tc>
@@ -1992,6 +1847,12 @@
                 <w:rStyle w:val="lev"/>
               </w:rPr>
             </w:pPr>
+            <w:r>
+              <w:rPr>
+                <w:rStyle w:val="lev"/>
+              </w:rPr>
+              <w:t>10</w:t>
+            </w:r>
           </w:p>
         </w:tc>
         <w:tc>
@@ -2005,6 +1866,12 @@
                 <w:rStyle w:val="lev"/>
               </w:rPr>
             </w:pPr>
+            <w:r>
+              <w:rPr>
+                <w:rStyle w:val="lev"/>
+              </w:rPr>
+              <w:t>2</w:t>
+            </w:r>
           </w:p>
         </w:tc>
         <w:tc>
@@ -2015,6 +1882,82 @@
             <w:pPr>
               <w:jc w:val="both"/>
             </w:pPr>
+            <w:r>
+              <w:t xml:space="preserve">Faire le descriptif détaillé avec lien correspondant au soft actuel </w:t>
+            </w:r>
+          </w:p>
+        </w:tc>
+        <w:tc>
+          <w:tcPr>
+            <w:tcW w:w="850" w:type="dxa"/>
+          </w:tcPr>
+          <w:p>
+            <w:pPr>
+              <w:jc w:val="center"/>
+            </w:pPr>
+          </w:p>
+        </w:tc>
+        <w:tc>
+          <w:tcPr>
+            <w:tcW w:w="1276" w:type="dxa"/>
+          </w:tcPr>
+          <w:p>
+            <w:pPr>
+              <w:jc w:val="center"/>
+            </w:pPr>
+          </w:p>
+        </w:tc>
+      </w:tr>
+      <w:tr>
+        <w:tc>
+          <w:tcPr>
+            <w:tcW w:w="675" w:type="dxa"/>
+          </w:tcPr>
+          <w:p>
+            <w:pPr>
+              <w:jc w:val="center"/>
+              <w:rPr>
+                <w:rStyle w:val="lev"/>
+              </w:rPr>
+            </w:pPr>
+            <w:r>
+              <w:rPr>
+                <w:rStyle w:val="lev"/>
+              </w:rPr>
+              <w:t>11</w:t>
+            </w:r>
+          </w:p>
+        </w:tc>
+        <w:tc>
+          <w:tcPr>
+            <w:tcW w:w="993" w:type="dxa"/>
+          </w:tcPr>
+          <w:p>
+            <w:pPr>
+              <w:jc w:val="center"/>
+              <w:rPr>
+                <w:rStyle w:val="lev"/>
+              </w:rPr>
+            </w:pPr>
+            <w:r>
+              <w:rPr>
+                <w:rStyle w:val="lev"/>
+              </w:rPr>
+              <w:t>1</w:t>
+            </w:r>
+          </w:p>
+        </w:tc>
+        <w:tc>
+          <w:tcPr>
+            <w:tcW w:w="6237" w:type="dxa"/>
+          </w:tcPr>
+          <w:p>
+            <w:pPr>
+              <w:jc w:val="both"/>
+            </w:pPr>
+            <w:r>
+              <w:t xml:space="preserve">Valider le fonctionnement avec client </w:t>
+            </w:r>
           </w:p>
         </w:tc>
         <w:tc>
@@ -2441,37 +2384,18 @@
           </w:tcPr>
           <w:p>
             <w:r>
-              <w:t>Modification P</w:t>
-            </w:r>
-            <w:r>
-              <w:t>artie graphique d</w:t>
-            </w:r>
-            <w:r>
-              <w:t>e</w:t>
-            </w:r>
+              <w:t xml:space="preserve">Réaliser une fonction PWM, pour gérer l’allumage des </w:t>
+            </w:r>
+            <w:proofErr w:type="spellStart"/>
+            <w:r>
+              <w:t>LEDs</w:t>
+            </w:r>
+            <w:proofErr w:type="spellEnd"/>
             <w:r>
               <w:t xml:space="preserve"> </w:t>
             </w:r>
             <w:r>
-              <w:t>l’</w:t>
-            </w:r>
-            <w:r>
-              <w:t>application C#</w:t>
-            </w:r>
-            <w:r>
-              <w:t>, fonction</w:t>
-            </w:r>
-            <w:r>
-              <w:t>s</w:t>
-            </w:r>
-            <w:r>
-              <w:t xml:space="preserve"> </w:t>
-            </w:r>
-            <w:r>
-              <w:t>x, y</w:t>
-            </w:r>
-            <w:r>
-              <w:t>…</w:t>
+              <w:t>(0-100%)</w:t>
             </w:r>
           </w:p>
         </w:tc>
@@ -2483,9 +2407,6 @@
             <w:pPr>
               <w:jc w:val="center"/>
             </w:pPr>
-            <w:r>
-              <w:t>BGR</w:t>
-            </w:r>
           </w:p>
         </w:tc>
         <w:tc>
@@ -2522,20 +2443,7 @@
           <w:tcPr>
             <w:tcW w:w="7269" w:type="dxa"/>
           </w:tcPr>
-          <w:p>
-            <w:r>
-              <w:t>Nouvelle f</w:t>
-            </w:r>
-            <w:r>
-              <w:t>onction de co</w:t>
-            </w:r>
-            <w:r>
-              <w:t>m</w:t>
-            </w:r>
-            <w:r>
-              <w:t>munication UART vers la cible</w:t>
-            </w:r>
-          </w:p>
+          <w:p/>
         </w:tc>
         <w:tc>
           <w:tcPr>
@@ -2569,13 +2477,23 @@
                 <w:rStyle w:val="lev"/>
               </w:rPr>
             </w:pPr>
+            <w:r>
+              <w:rPr>
+                <w:rStyle w:val="lev"/>
+              </w:rPr>
+              <w:t>3</w:t>
+            </w:r>
           </w:p>
         </w:tc>
         <w:tc>
           <w:tcPr>
             <w:tcW w:w="7269" w:type="dxa"/>
           </w:tcPr>
-          <w:p/>
+          <w:p>
+            <w:r>
+              <w:t>Modifier si nécessaire la gestion de l’interruption de l’accéléromètre</w:t>
+            </w:r>
+          </w:p>
         </w:tc>
         <w:tc>
           <w:tcPr>
@@ -2609,25 +2527,13 @@
                 <w:rStyle w:val="lev"/>
               </w:rPr>
             </w:pPr>
-            <w:proofErr w:type="gramStart"/>
-            <w:r>
-              <w:rPr>
-                <w:rStyle w:val="lev"/>
-              </w:rPr>
-              <w:t>n</w:t>
-            </w:r>
-            <w:proofErr w:type="gramEnd"/>
           </w:p>
         </w:tc>
         <w:tc>
           <w:tcPr>
             <w:tcW w:w="7269" w:type="dxa"/>
           </w:tcPr>
-          <w:p>
-            <w:r>
-              <w:t>Réalisation d’un algorithme permettant de modifier un fichier HEX</w:t>
-            </w:r>
-          </w:p>
+          <w:p/>
         </w:tc>
         <w:tc>
           <w:tcPr>
@@ -2668,7 +2574,10 @@
         </w:numPr>
       </w:pPr>
       <w:r>
-        <w:t>Visual studio</w:t>
+        <w:t>M</w:t>
+      </w:r>
+      <w:r>
+        <w:t>PLAB X</w:t>
       </w:r>
       <w:r>
         <w:t xml:space="preserve"> version </w:t>
@@ -2677,7 +2586,33 @@
         <w:t>IDE</w:t>
       </w:r>
       <w:r>
-        <w:t xml:space="preserve"> et version compilateur</w:t>
+        <w:t xml:space="preserve"> 5.15</w:t>
+      </w:r>
+      <w:r>
+        <w:sym w:font="Wingdings" w:char="F0E0"/>
+      </w:r>
+      <w:r>
+        <w:t xml:space="preserve"> </w:t>
+      </w:r>
+      <w:proofErr w:type="gramStart"/>
+      <w:r>
+        <w:t xml:space="preserve">V5.5 </w:t>
+      </w:r>
+      <w:r>
+        <w:t xml:space="preserve"> et</w:t>
+      </w:r>
+      <w:proofErr w:type="gramEnd"/>
+      <w:r>
+        <w:t xml:space="preserve"> version compilateur</w:t>
+      </w:r>
+      <w:r>
+        <w:t xml:space="preserve"> 2.15</w:t>
+      </w:r>
+      <w:r>
+        <w:sym w:font="Wingdings" w:char="F0E0"/>
+      </w:r>
+      <w:r>
+        <w:t xml:space="preserve"> V2.5 </w:t>
       </w:r>
     </w:p>
     <w:p>
@@ -2688,24 +2623,11 @@
           <w:numId w:val="5"/>
         </w:numPr>
       </w:pPr>
-      <w:r>
-        <w:t>M</w:t>
-      </w:r>
-      <w:r>
-        <w:t>PLAB X</w:t>
-      </w:r>
-      <w:r>
-        <w:t xml:space="preserve"> </w:t>
-      </w:r>
-      <w:r>
-        <w:t xml:space="preserve">version </w:t>
-      </w:r>
-      <w:r>
-        <w:t>IDE</w:t>
-      </w:r>
-      <w:r>
-        <w:t xml:space="preserve"> et version compilateur</w:t>
-      </w:r>
+      <w:proofErr w:type="spellStart"/>
+      <w:r>
+        <w:t>PCB_DéElectronique</w:t>
+      </w:r>
+      <w:proofErr w:type="spellEnd"/>
     </w:p>
     <w:p>
       <w:pPr>
@@ -2716,23 +2638,10 @@
         </w:numPr>
       </w:pPr>
       <w:r>
-        <w:lastRenderedPageBreak/>
-        <w:t>Kit PIC32</w:t>
-      </w:r>
-    </w:p>
-    <w:p>
-      <w:pPr>
-        <w:pStyle w:val="Paragraphedeliste"/>
-        <w:numPr>
-          <w:ilvl w:val="0"/>
-          <w:numId w:val="5"/>
-        </w:numPr>
-      </w:pPr>
-      <w:r>
-        <w:t>Débuggeur</w:t>
-      </w:r>
-      <w:r>
-        <w:t xml:space="preserve"> SNAP</w:t>
+        <w:t>Dé</w:t>
+      </w:r>
+      <w:r>
+        <w:t xml:space="preserve">bugger : Mplab-ICD4 </w:t>
       </w:r>
     </w:p>
     <w:p/>
@@ -2764,7 +2673,10 @@
         <w:t xml:space="preserve">u projet </w:t>
       </w:r>
       <w:r>
-        <w:t>2203_BootloaderPic32</w:t>
+        <w:rPr>
+          <w:i/>
+        </w:rPr>
+        <w:t>2113_DeElectronique</w:t>
       </w:r>
       <w:r>
         <w:t>.</w:t>
@@ -2825,11 +2737,14 @@
       </w:r>
     </w:p>
     <w:p>
-      <w:proofErr w:type="gramStart"/>
-      <w:r>
-        <w:t>racine</w:t>
-      </w:r>
-      <w:proofErr w:type="gramEnd"/>
+      <w:pPr>
+        <w:rPr>
+          <w:b/>
+        </w:rPr>
+      </w:pPr>
+      <w:r>
+        <w:t>Racine</w:t>
+      </w:r>
       <w:r>
         <w:t xml:space="preserve"> du dossier </w:t>
       </w:r>
@@ -2846,9 +2761,36 @@
         <w:t>soft</w:t>
       </w:r>
     </w:p>
+    <w:p>
+      <w:pPr>
+        <w:rPr>
+          <w:bCs/>
+        </w:rPr>
+      </w:pPr>
+      <w:r>
+        <w:rPr>
+          <w:bCs/>
+        </w:rPr>
+        <w:t>Ou sur GitHub :</w:t>
+      </w:r>
+    </w:p>
+    <w:p>
+      <w:pPr>
+        <w:rPr>
+          <w:i/>
+        </w:rPr>
+      </w:pPr>
+      <w:r>
+        <w:rPr>
+          <w:i/>
+        </w:rPr>
+        <w:t>https://github.com/ETML-ES-SLO/PRJ_2113_D-sElectronique</w:t>
+      </w:r>
+    </w:p>
+    <w:p/>
     <w:sectPr>
-      <w:headerReference w:type="default" r:id="rId8"/>
-      <w:footerReference w:type="default" r:id="rId9"/>
+      <w:headerReference w:type="default" r:id="rId10"/>
+      <w:footerReference w:type="default" r:id="rId11"/>
       <w:pgSz w:w="11906" w:h="16838"/>
       <w:pgMar w:top="1417" w:right="1417" w:bottom="1417" w:left="1417" w:header="708" w:footer="708" w:gutter="0"/>
       <w:cols w:space="708"/>
@@ -2859,7 +2801,7 @@
 </file>
 
 <file path=word/endnotes.xml><?xml version="1.0" encoding="utf-8"?>
-<w:endnotes xmlns:wpc="http://schemas.microsoft.com/office/word/2010/wordprocessingCanvas" xmlns:cx="http://schemas.microsoft.com/office/drawing/2014/chartex" xmlns:cx1="http://schemas.microsoft.com/office/drawing/2015/9/8/chartex" xmlns:cx2="http://schemas.microsoft.com/office/drawing/2015/10/21/chartex" xmlns:cx3="http://schemas.microsoft.com/office/drawing/2016/5/9/chartex" xmlns:cx4="http://schemas.microsoft.com/office/drawing/2016/5/10/chartex" xmlns:cx5="http://schemas.microsoft.com/office/drawing/2016/5/11/chartex" xmlns:cx6="http://schemas.microsoft.com/office/drawing/2016/5/12/chartex" xmlns:cx7="http://schemas.microsoft.com/office/drawing/2016/5/13/chartex" xmlns:cx8="http://schemas.microsoft.com/office/drawing/2016/5/14/chartex" xmlns:mc="http://schemas.openxmlformats.org/markup-compatibility/2006" xmlns:aink="http://schemas.microsoft.com/office/drawing/2016/ink" xmlns:am3d="http://schemas.microsoft.com/office/drawing/2017/model3d" xmlns:o="urn:schemas-microsoft-com:office:office" xmlns:oel="http://schemas.microsoft.com/office/2019/extlst" xmlns:r="http://schemas.openxmlformats.org/officeDocument/2006/relationships" xmlns:m="http://schemas.openxmlformats.org/officeDocument/2006/math" xmlns:v="urn:schemas-microsoft-com:vml" xmlns:wp14="http://schemas.microsoft.com/office/word/2010/wordprocessingDrawing" xmlns:wp="http://schemas.openxmlformats.org/drawingml/2006/wordprocessingDrawing" xmlns:w10="urn:schemas-microsoft-com:office:word" xmlns:w="http://schemas.openxmlformats.org/wordprocessingml/2006/main" xmlns:w14="http://schemas.microsoft.com/office/word/2010/wordml" xmlns:w15="http://schemas.microsoft.com/office/word/2012/wordml" xmlns:w16cex="http://schemas.microsoft.com/office/word/2018/wordml/cex" xmlns:w16cid="http://schemas.microsoft.com/office/word/2016/wordml/cid" xmlns:w16="http://schemas.microsoft.com/office/word/2018/wordml" xmlns:w16du="http://schemas.microsoft.com/office/word/2023/wordml/word16du" xmlns:w16sdtdh="http://schemas.microsoft.com/office/word/2020/wordml/sdtdatahash" xmlns:w16se="http://schemas.microsoft.com/office/word/2015/wordml/symex" xmlns:wpg="http://schemas.microsoft.com/office/word/2010/wordprocessingGroup" xmlns:wpi="http://schemas.microsoft.com/office/word/2010/wordprocessingInk" xmlns:wne="http://schemas.microsoft.com/office/word/2006/wordml" xmlns:wps="http://schemas.microsoft.com/office/word/2010/wordprocessingShape" mc:Ignorable="w14 w15 w16se w16cid w16 w16cex w16sdtdh wp14">
+<w:endnotes xmlns:wpc="http://schemas.microsoft.com/office/word/2010/wordprocessingCanvas" xmlns:cx="http://schemas.microsoft.com/office/drawing/2014/chartex" xmlns:cx1="http://schemas.microsoft.com/office/drawing/2015/9/8/chartex" xmlns:cx2="http://schemas.microsoft.com/office/drawing/2015/10/21/chartex" xmlns:cx3="http://schemas.microsoft.com/office/drawing/2016/5/9/chartex" xmlns:cx4="http://schemas.microsoft.com/office/drawing/2016/5/10/chartex" xmlns:cx5="http://schemas.microsoft.com/office/drawing/2016/5/11/chartex" xmlns:cx6="http://schemas.microsoft.com/office/drawing/2016/5/12/chartex" xmlns:cx7="http://schemas.microsoft.com/office/drawing/2016/5/13/chartex" xmlns:cx8="http://schemas.microsoft.com/office/drawing/2016/5/14/chartex" xmlns:mc="http://schemas.openxmlformats.org/markup-compatibility/2006" xmlns:aink="http://schemas.microsoft.com/office/drawing/2016/ink" xmlns:am3d="http://schemas.microsoft.com/office/drawing/2017/model3d" xmlns:o="urn:schemas-microsoft-com:office:office" xmlns:r="http://schemas.openxmlformats.org/officeDocument/2006/relationships" xmlns:m="http://schemas.openxmlformats.org/officeDocument/2006/math" xmlns:v="urn:schemas-microsoft-com:vml" xmlns:wp14="http://schemas.microsoft.com/office/word/2010/wordprocessingDrawing" xmlns:wp="http://schemas.openxmlformats.org/drawingml/2006/wordprocessingDrawing" xmlns:w10="urn:schemas-microsoft-com:office:word" xmlns:w="http://schemas.openxmlformats.org/wordprocessingml/2006/main" xmlns:w14="http://schemas.microsoft.com/office/word/2010/wordml" xmlns:w15="http://schemas.microsoft.com/office/word/2012/wordml" xmlns:w16cex="http://schemas.microsoft.com/office/word/2018/wordml/cex" xmlns:w16cid="http://schemas.microsoft.com/office/word/2016/wordml/cid" xmlns:w16="http://schemas.microsoft.com/office/word/2018/wordml" xmlns:w16se="http://schemas.microsoft.com/office/word/2015/wordml/symex" xmlns:wpg="http://schemas.microsoft.com/office/word/2010/wordprocessingGroup" xmlns:wpi="http://schemas.microsoft.com/office/word/2010/wordprocessingInk" xmlns:wne="http://schemas.microsoft.com/office/word/2006/wordml" xmlns:wps="http://schemas.microsoft.com/office/word/2010/wordprocessingShape" mc:Ignorable="w14 w15 w16se w16cid w16 w16cex wp14">
   <w:endnote w:type="separator" w:id="-1">
     <w:p>
       <w:pPr>
@@ -2884,7 +2826,7 @@
 </file>
 
 <file path=word/footer1.xml><?xml version="1.0" encoding="utf-8"?>
-<w:ftr xmlns:wpc="http://schemas.microsoft.com/office/word/2010/wordprocessingCanvas" xmlns:cx="http://schemas.microsoft.com/office/drawing/2014/chartex" xmlns:cx1="http://schemas.microsoft.com/office/drawing/2015/9/8/chartex" xmlns:cx2="http://schemas.microsoft.com/office/drawing/2015/10/21/chartex" xmlns:cx3="http://schemas.microsoft.com/office/drawing/2016/5/9/chartex" xmlns:cx4="http://schemas.microsoft.com/office/drawing/2016/5/10/chartex" xmlns:cx5="http://schemas.microsoft.com/office/drawing/2016/5/11/chartex" xmlns:cx6="http://schemas.microsoft.com/office/drawing/2016/5/12/chartex" xmlns:cx7="http://schemas.microsoft.com/office/drawing/2016/5/13/chartex" xmlns:cx8="http://schemas.microsoft.com/office/drawing/2016/5/14/chartex" xmlns:mc="http://schemas.openxmlformats.org/markup-compatibility/2006" xmlns:aink="http://schemas.microsoft.com/office/drawing/2016/ink" xmlns:am3d="http://schemas.microsoft.com/office/drawing/2017/model3d" xmlns:o="urn:schemas-microsoft-com:office:office" xmlns:oel="http://schemas.microsoft.com/office/2019/extlst" xmlns:r="http://schemas.openxmlformats.org/officeDocument/2006/relationships" xmlns:m="http://schemas.openxmlformats.org/officeDocument/2006/math" xmlns:v="urn:schemas-microsoft-com:vml" xmlns:wp14="http://schemas.microsoft.com/office/word/2010/wordprocessingDrawing" xmlns:wp="http://schemas.openxmlformats.org/drawingml/2006/wordprocessingDrawing" xmlns:w10="urn:schemas-microsoft-com:office:word" xmlns:w="http://schemas.openxmlformats.org/wordprocessingml/2006/main" xmlns:w14="http://schemas.microsoft.com/office/word/2010/wordml" xmlns:w15="http://schemas.microsoft.com/office/word/2012/wordml" xmlns:w16cex="http://schemas.microsoft.com/office/word/2018/wordml/cex" xmlns:w16cid="http://schemas.microsoft.com/office/word/2016/wordml/cid" xmlns:w16="http://schemas.microsoft.com/office/word/2018/wordml" xmlns:w16du="http://schemas.microsoft.com/office/word/2023/wordml/word16du" xmlns:w16sdtdh="http://schemas.microsoft.com/office/word/2020/wordml/sdtdatahash" xmlns:w16se="http://schemas.microsoft.com/office/word/2015/wordml/symex" xmlns:wpg="http://schemas.microsoft.com/office/word/2010/wordprocessingGroup" xmlns:wpi="http://schemas.microsoft.com/office/word/2010/wordprocessingInk" xmlns:wne="http://schemas.microsoft.com/office/word/2006/wordml" xmlns:wps="http://schemas.microsoft.com/office/word/2010/wordprocessingShape" mc:Ignorable="w14 w15 w16se w16cid w16 w16cex w16sdtdh wp14">
+<w:ftr xmlns:wpc="http://schemas.microsoft.com/office/word/2010/wordprocessingCanvas" xmlns:cx="http://schemas.microsoft.com/office/drawing/2014/chartex" xmlns:cx1="http://schemas.microsoft.com/office/drawing/2015/9/8/chartex" xmlns:cx2="http://schemas.microsoft.com/office/drawing/2015/10/21/chartex" xmlns:cx3="http://schemas.microsoft.com/office/drawing/2016/5/9/chartex" xmlns:cx4="http://schemas.microsoft.com/office/drawing/2016/5/10/chartex" xmlns:cx5="http://schemas.microsoft.com/office/drawing/2016/5/11/chartex" xmlns:cx6="http://schemas.microsoft.com/office/drawing/2016/5/12/chartex" xmlns:cx7="http://schemas.microsoft.com/office/drawing/2016/5/13/chartex" xmlns:cx8="http://schemas.microsoft.com/office/drawing/2016/5/14/chartex" xmlns:mc="http://schemas.openxmlformats.org/markup-compatibility/2006" xmlns:aink="http://schemas.microsoft.com/office/drawing/2016/ink" xmlns:am3d="http://schemas.microsoft.com/office/drawing/2017/model3d" xmlns:o="urn:schemas-microsoft-com:office:office" xmlns:r="http://schemas.openxmlformats.org/officeDocument/2006/relationships" xmlns:m="http://schemas.openxmlformats.org/officeDocument/2006/math" xmlns:v="urn:schemas-microsoft-com:vml" xmlns:wp14="http://schemas.microsoft.com/office/word/2010/wordprocessingDrawing" xmlns:wp="http://schemas.openxmlformats.org/drawingml/2006/wordprocessingDrawing" xmlns:w10="urn:schemas-microsoft-com:office:word" xmlns:w="http://schemas.openxmlformats.org/wordprocessingml/2006/main" xmlns:w14="http://schemas.microsoft.com/office/word/2010/wordml" xmlns:w15="http://schemas.microsoft.com/office/word/2012/wordml" xmlns:w16cex="http://schemas.microsoft.com/office/word/2018/wordml/cex" xmlns:w16cid="http://schemas.microsoft.com/office/word/2016/wordml/cid" xmlns:w16="http://schemas.microsoft.com/office/word/2018/wordml" xmlns:w16se="http://schemas.microsoft.com/office/word/2015/wordml/symex" xmlns:wpg="http://schemas.microsoft.com/office/word/2010/wordprocessingGroup" xmlns:wpi="http://schemas.microsoft.com/office/word/2010/wordprocessingInk" xmlns:wne="http://schemas.microsoft.com/office/word/2006/wordml" xmlns:wps="http://schemas.microsoft.com/office/word/2010/wordprocessingShape" mc:Ignorable="w14 w15 w16se w16cid w16 w16cex wp14">
   <w:p>
     <w:pPr>
       <w:pStyle w:val="Pieddepage"/>
@@ -3000,7 +2942,7 @@
 </file>
 
 <file path=word/footnotes.xml><?xml version="1.0" encoding="utf-8"?>
-<w:footnotes xmlns:wpc="http://schemas.microsoft.com/office/word/2010/wordprocessingCanvas" xmlns:cx="http://schemas.microsoft.com/office/drawing/2014/chartex" xmlns:cx1="http://schemas.microsoft.com/office/drawing/2015/9/8/chartex" xmlns:cx2="http://schemas.microsoft.com/office/drawing/2015/10/21/chartex" xmlns:cx3="http://schemas.microsoft.com/office/drawing/2016/5/9/chartex" xmlns:cx4="http://schemas.microsoft.com/office/drawing/2016/5/10/chartex" xmlns:cx5="http://schemas.microsoft.com/office/drawing/2016/5/11/chartex" xmlns:cx6="http://schemas.microsoft.com/office/drawing/2016/5/12/chartex" xmlns:cx7="http://schemas.microsoft.com/office/drawing/2016/5/13/chartex" xmlns:cx8="http://schemas.microsoft.com/office/drawing/2016/5/14/chartex" xmlns:mc="http://schemas.openxmlformats.org/markup-compatibility/2006" xmlns:aink="http://schemas.microsoft.com/office/drawing/2016/ink" xmlns:am3d="http://schemas.microsoft.com/office/drawing/2017/model3d" xmlns:o="urn:schemas-microsoft-com:office:office" xmlns:oel="http://schemas.microsoft.com/office/2019/extlst" xmlns:r="http://schemas.openxmlformats.org/officeDocument/2006/relationships" xmlns:m="http://schemas.openxmlformats.org/officeDocument/2006/math" xmlns:v="urn:schemas-microsoft-com:vml" xmlns:wp14="http://schemas.microsoft.com/office/word/2010/wordprocessingDrawing" xmlns:wp="http://schemas.openxmlformats.org/drawingml/2006/wordprocessingDrawing" xmlns:w10="urn:schemas-microsoft-com:office:word" xmlns:w="http://schemas.openxmlformats.org/wordprocessingml/2006/main" xmlns:w14="http://schemas.microsoft.com/office/word/2010/wordml" xmlns:w15="http://schemas.microsoft.com/office/word/2012/wordml" xmlns:w16cex="http://schemas.microsoft.com/office/word/2018/wordml/cex" xmlns:w16cid="http://schemas.microsoft.com/office/word/2016/wordml/cid" xmlns:w16="http://schemas.microsoft.com/office/word/2018/wordml" xmlns:w16du="http://schemas.microsoft.com/office/word/2023/wordml/word16du" xmlns:w16sdtdh="http://schemas.microsoft.com/office/word/2020/wordml/sdtdatahash" xmlns:w16se="http://schemas.microsoft.com/office/word/2015/wordml/symex" xmlns:wpg="http://schemas.microsoft.com/office/word/2010/wordprocessingGroup" xmlns:wpi="http://schemas.microsoft.com/office/word/2010/wordprocessingInk" xmlns:wne="http://schemas.microsoft.com/office/word/2006/wordml" xmlns:wps="http://schemas.microsoft.com/office/word/2010/wordprocessingShape" mc:Ignorable="w14 w15 w16se w16cid w16 w16cex w16sdtdh wp14">
+<w:footnotes xmlns:wpc="http://schemas.microsoft.com/office/word/2010/wordprocessingCanvas" xmlns:cx="http://schemas.microsoft.com/office/drawing/2014/chartex" xmlns:cx1="http://schemas.microsoft.com/office/drawing/2015/9/8/chartex" xmlns:cx2="http://schemas.microsoft.com/office/drawing/2015/10/21/chartex" xmlns:cx3="http://schemas.microsoft.com/office/drawing/2016/5/9/chartex" xmlns:cx4="http://schemas.microsoft.com/office/drawing/2016/5/10/chartex" xmlns:cx5="http://schemas.microsoft.com/office/drawing/2016/5/11/chartex" xmlns:cx6="http://schemas.microsoft.com/office/drawing/2016/5/12/chartex" xmlns:cx7="http://schemas.microsoft.com/office/drawing/2016/5/13/chartex" xmlns:cx8="http://schemas.microsoft.com/office/drawing/2016/5/14/chartex" xmlns:mc="http://schemas.openxmlformats.org/markup-compatibility/2006" xmlns:aink="http://schemas.microsoft.com/office/drawing/2016/ink" xmlns:am3d="http://schemas.microsoft.com/office/drawing/2017/model3d" xmlns:o="urn:schemas-microsoft-com:office:office" xmlns:r="http://schemas.openxmlformats.org/officeDocument/2006/relationships" xmlns:m="http://schemas.openxmlformats.org/officeDocument/2006/math" xmlns:v="urn:schemas-microsoft-com:vml" xmlns:wp14="http://schemas.microsoft.com/office/word/2010/wordprocessingDrawing" xmlns:wp="http://schemas.openxmlformats.org/drawingml/2006/wordprocessingDrawing" xmlns:w10="urn:schemas-microsoft-com:office:word" xmlns:w="http://schemas.openxmlformats.org/wordprocessingml/2006/main" xmlns:w14="http://schemas.microsoft.com/office/word/2010/wordml" xmlns:w15="http://schemas.microsoft.com/office/word/2012/wordml" xmlns:w16cex="http://schemas.microsoft.com/office/word/2018/wordml/cex" xmlns:w16cid="http://schemas.microsoft.com/office/word/2016/wordml/cid" xmlns:w16="http://schemas.microsoft.com/office/word/2018/wordml" xmlns:w16se="http://schemas.microsoft.com/office/word/2015/wordml/symex" xmlns:wpg="http://schemas.microsoft.com/office/word/2010/wordprocessingGroup" xmlns:wpi="http://schemas.microsoft.com/office/word/2010/wordprocessingInk" xmlns:wne="http://schemas.microsoft.com/office/word/2006/wordml" xmlns:wps="http://schemas.microsoft.com/office/word/2010/wordprocessingShape" mc:Ignorable="w14 w15 w16se w16cid w16 w16cex wp14">
   <w:footnote w:type="separator" w:id="-1">
     <w:p>
       <w:pPr>
@@ -3025,7 +2967,7 @@
 </file>
 
 <file path=word/header1.xml><?xml version="1.0" encoding="utf-8"?>
-<w:hdr xmlns:wpc="http://schemas.microsoft.com/office/word/2010/wordprocessingCanvas" xmlns:cx="http://schemas.microsoft.com/office/drawing/2014/chartex" xmlns:cx1="http://schemas.microsoft.com/office/drawing/2015/9/8/chartex" xmlns:cx2="http://schemas.microsoft.com/office/drawing/2015/10/21/chartex" xmlns:cx3="http://schemas.microsoft.com/office/drawing/2016/5/9/chartex" xmlns:cx4="http://schemas.microsoft.com/office/drawing/2016/5/10/chartex" xmlns:cx5="http://schemas.microsoft.com/office/drawing/2016/5/11/chartex" xmlns:cx6="http://schemas.microsoft.com/office/drawing/2016/5/12/chartex" xmlns:cx7="http://schemas.microsoft.com/office/drawing/2016/5/13/chartex" xmlns:cx8="http://schemas.microsoft.com/office/drawing/2016/5/14/chartex" xmlns:mc="http://schemas.openxmlformats.org/markup-compatibility/2006" xmlns:aink="http://schemas.microsoft.com/office/drawing/2016/ink" xmlns:am3d="http://schemas.microsoft.com/office/drawing/2017/model3d" xmlns:o="urn:schemas-microsoft-com:office:office" xmlns:oel="http://schemas.microsoft.com/office/2019/extlst" xmlns:r="http://schemas.openxmlformats.org/officeDocument/2006/relationships" xmlns:m="http://schemas.openxmlformats.org/officeDocument/2006/math" xmlns:v="urn:schemas-microsoft-com:vml" xmlns:wp14="http://schemas.microsoft.com/office/word/2010/wordprocessingDrawing" xmlns:wp="http://schemas.openxmlformats.org/drawingml/2006/wordprocessingDrawing" xmlns:w10="urn:schemas-microsoft-com:office:word" xmlns:w="http://schemas.openxmlformats.org/wordprocessingml/2006/main" xmlns:w14="http://schemas.microsoft.com/office/word/2010/wordml" xmlns:w15="http://schemas.microsoft.com/office/word/2012/wordml" xmlns:w16cex="http://schemas.microsoft.com/office/word/2018/wordml/cex" xmlns:w16cid="http://schemas.microsoft.com/office/word/2016/wordml/cid" xmlns:w16="http://schemas.microsoft.com/office/word/2018/wordml" xmlns:w16du="http://schemas.microsoft.com/office/word/2023/wordml/word16du" xmlns:w16sdtdh="http://schemas.microsoft.com/office/word/2020/wordml/sdtdatahash" xmlns:w16se="http://schemas.microsoft.com/office/word/2015/wordml/symex" xmlns:wpg="http://schemas.microsoft.com/office/word/2010/wordprocessingGroup" xmlns:wpi="http://schemas.microsoft.com/office/word/2010/wordprocessingInk" xmlns:wne="http://schemas.microsoft.com/office/word/2006/wordml" xmlns:wps="http://schemas.microsoft.com/office/word/2010/wordprocessingShape" mc:Ignorable="w14 w15 w16se w16cid w16 w16cex w16sdtdh wp14">
+<w:hdr xmlns:wpc="http://schemas.microsoft.com/office/word/2010/wordprocessingCanvas" xmlns:cx="http://schemas.microsoft.com/office/drawing/2014/chartex" xmlns:cx1="http://schemas.microsoft.com/office/drawing/2015/9/8/chartex" xmlns:cx2="http://schemas.microsoft.com/office/drawing/2015/10/21/chartex" xmlns:cx3="http://schemas.microsoft.com/office/drawing/2016/5/9/chartex" xmlns:cx4="http://schemas.microsoft.com/office/drawing/2016/5/10/chartex" xmlns:cx5="http://schemas.microsoft.com/office/drawing/2016/5/11/chartex" xmlns:cx6="http://schemas.microsoft.com/office/drawing/2016/5/12/chartex" xmlns:cx7="http://schemas.microsoft.com/office/drawing/2016/5/13/chartex" xmlns:cx8="http://schemas.microsoft.com/office/drawing/2016/5/14/chartex" xmlns:mc="http://schemas.openxmlformats.org/markup-compatibility/2006" xmlns:aink="http://schemas.microsoft.com/office/drawing/2016/ink" xmlns:am3d="http://schemas.microsoft.com/office/drawing/2017/model3d" xmlns:o="urn:schemas-microsoft-com:office:office" xmlns:r="http://schemas.openxmlformats.org/officeDocument/2006/relationships" xmlns:m="http://schemas.openxmlformats.org/officeDocument/2006/math" xmlns:v="urn:schemas-microsoft-com:vml" xmlns:wp14="http://schemas.microsoft.com/office/word/2010/wordprocessingDrawing" xmlns:wp="http://schemas.openxmlformats.org/drawingml/2006/wordprocessingDrawing" xmlns:w10="urn:schemas-microsoft-com:office:word" xmlns:w="http://schemas.openxmlformats.org/wordprocessingml/2006/main" xmlns:w14="http://schemas.microsoft.com/office/word/2010/wordml" xmlns:w15="http://schemas.microsoft.com/office/word/2012/wordml" xmlns:w16cex="http://schemas.microsoft.com/office/word/2018/wordml/cex" xmlns:w16cid="http://schemas.microsoft.com/office/word/2016/wordml/cid" xmlns:w16="http://schemas.microsoft.com/office/word/2018/wordml" xmlns:w16se="http://schemas.microsoft.com/office/word/2015/wordml/symex" xmlns:wpg="http://schemas.microsoft.com/office/word/2010/wordprocessingGroup" xmlns:wpi="http://schemas.microsoft.com/office/word/2010/wordprocessingInk" xmlns:wne="http://schemas.microsoft.com/office/word/2006/wordml" xmlns:wps="http://schemas.microsoft.com/office/word/2010/wordprocessingShape" mc:Ignorable="w14 w15 w16se w16cid w16 w16cex wp14">
   <w:p>
     <w:pPr>
       <w:tabs>
@@ -3162,7 +3104,7 @@
 </file>
 
 <file path=word/numbering.xml><?xml version="1.0" encoding="utf-8"?>
-<w:numbering xmlns:wpc="http://schemas.microsoft.com/office/word/2010/wordprocessingCanvas" xmlns:cx="http://schemas.microsoft.com/office/drawing/2014/chartex" xmlns:cx1="http://schemas.microsoft.com/office/drawing/2015/9/8/chartex" xmlns:cx2="http://schemas.microsoft.com/office/drawing/2015/10/21/chartex" xmlns:cx3="http://schemas.microsoft.com/office/drawing/2016/5/9/chartex" xmlns:cx4="http://schemas.microsoft.com/office/drawing/2016/5/10/chartex" xmlns:cx5="http://schemas.microsoft.com/office/drawing/2016/5/11/chartex" xmlns:cx6="http://schemas.microsoft.com/office/drawing/2016/5/12/chartex" xmlns:cx7="http://schemas.microsoft.com/office/drawing/2016/5/13/chartex" xmlns:cx8="http://schemas.microsoft.com/office/drawing/2016/5/14/chartex" xmlns:mc="http://schemas.openxmlformats.org/markup-compatibility/2006" xmlns:aink="http://schemas.microsoft.com/office/drawing/2016/ink" xmlns:am3d="http://schemas.microsoft.com/office/drawing/2017/model3d" xmlns:o="urn:schemas-microsoft-com:office:office" xmlns:oel="http://schemas.microsoft.com/office/2019/extlst" xmlns:r="http://schemas.openxmlformats.org/officeDocument/2006/relationships" xmlns:m="http://schemas.openxmlformats.org/officeDocument/2006/math" xmlns:v="urn:schemas-microsoft-com:vml" xmlns:wp14="http://schemas.microsoft.com/office/word/2010/wordprocessingDrawing" xmlns:wp="http://schemas.openxmlformats.org/drawingml/2006/wordprocessingDrawing" xmlns:w10="urn:schemas-microsoft-com:office:word" xmlns:w="http://schemas.openxmlformats.org/wordprocessingml/2006/main" xmlns:w14="http://schemas.microsoft.com/office/word/2010/wordml" xmlns:w15="http://schemas.microsoft.com/office/word/2012/wordml" xmlns:w16cex="http://schemas.microsoft.com/office/word/2018/wordml/cex" xmlns:w16cid="http://schemas.microsoft.com/office/word/2016/wordml/cid" xmlns:w16="http://schemas.microsoft.com/office/word/2018/wordml" xmlns:w16du="http://schemas.microsoft.com/office/word/2023/wordml/word16du" xmlns:w16sdtdh="http://schemas.microsoft.com/office/word/2020/wordml/sdtdatahash" xmlns:w16se="http://schemas.microsoft.com/office/word/2015/wordml/symex" xmlns:wpg="http://schemas.microsoft.com/office/word/2010/wordprocessingGroup" xmlns:wpi="http://schemas.microsoft.com/office/word/2010/wordprocessingInk" xmlns:wne="http://schemas.microsoft.com/office/word/2006/wordml" xmlns:wps="http://schemas.microsoft.com/office/word/2010/wordprocessingShape" mc:Ignorable="w14 w15 w16se w16cid w16 w16cex w16sdtdh wp14">
+<w:numbering xmlns:wpc="http://schemas.microsoft.com/office/word/2010/wordprocessingCanvas" xmlns:cx="http://schemas.microsoft.com/office/drawing/2014/chartex" xmlns:cx1="http://schemas.microsoft.com/office/drawing/2015/9/8/chartex" xmlns:cx2="http://schemas.microsoft.com/office/drawing/2015/10/21/chartex" xmlns:cx3="http://schemas.microsoft.com/office/drawing/2016/5/9/chartex" xmlns:cx4="http://schemas.microsoft.com/office/drawing/2016/5/10/chartex" xmlns:cx5="http://schemas.microsoft.com/office/drawing/2016/5/11/chartex" xmlns:cx6="http://schemas.microsoft.com/office/drawing/2016/5/12/chartex" xmlns:cx7="http://schemas.microsoft.com/office/drawing/2016/5/13/chartex" xmlns:cx8="http://schemas.microsoft.com/office/drawing/2016/5/14/chartex" xmlns:mc="http://schemas.openxmlformats.org/markup-compatibility/2006" xmlns:aink="http://schemas.microsoft.com/office/drawing/2016/ink" xmlns:am3d="http://schemas.microsoft.com/office/drawing/2017/model3d" xmlns:o="urn:schemas-microsoft-com:office:office" xmlns:r="http://schemas.openxmlformats.org/officeDocument/2006/relationships" xmlns:m="http://schemas.openxmlformats.org/officeDocument/2006/math" xmlns:v="urn:schemas-microsoft-com:vml" xmlns:wp14="http://schemas.microsoft.com/office/word/2010/wordprocessingDrawing" xmlns:wp="http://schemas.openxmlformats.org/drawingml/2006/wordprocessingDrawing" xmlns:w10="urn:schemas-microsoft-com:office:word" xmlns:w="http://schemas.openxmlformats.org/wordprocessingml/2006/main" xmlns:w14="http://schemas.microsoft.com/office/word/2010/wordml" xmlns:w15="http://schemas.microsoft.com/office/word/2012/wordml" xmlns:w16cex="http://schemas.microsoft.com/office/word/2018/wordml/cex" xmlns:w16cid="http://schemas.microsoft.com/office/word/2016/wordml/cid" xmlns:w16="http://schemas.microsoft.com/office/word/2018/wordml" xmlns:w16se="http://schemas.microsoft.com/office/word/2015/wordml/symex" xmlns:wpg="http://schemas.microsoft.com/office/word/2010/wordprocessingGroup" xmlns:wpi="http://schemas.microsoft.com/office/word/2010/wordprocessingInk" xmlns:wne="http://schemas.microsoft.com/office/word/2006/wordml" xmlns:wps="http://schemas.microsoft.com/office/word/2010/wordprocessingShape" mc:Ignorable="w14 w15 w16se w16cid w16 w16cex wp14">
   <w:abstractNum w:abstractNumId="0" w15:restartNumberingAfterBreak="0">
     <w:nsid w:val="06BB64DD"/>
     <w:multiLevelType w:val="hybridMultilevel"/>
@@ -3710,26 +3652,26 @@
       </w:rPr>
     </w:lvl>
   </w:abstractNum>
-  <w:num w:numId="1" w16cid:durableId="1536314151">
+  <w:num w:numId="1">
     <w:abstractNumId w:val="4"/>
   </w:num>
-  <w:num w:numId="2" w16cid:durableId="38404559">
+  <w:num w:numId="2">
     <w:abstractNumId w:val="0"/>
   </w:num>
-  <w:num w:numId="3" w16cid:durableId="1344044290">
+  <w:num w:numId="3">
     <w:abstractNumId w:val="3"/>
   </w:num>
-  <w:num w:numId="4" w16cid:durableId="133572892">
+  <w:num w:numId="4">
     <w:abstractNumId w:val="2"/>
   </w:num>
-  <w:num w:numId="5" w16cid:durableId="607396811">
+  <w:num w:numId="5">
     <w:abstractNumId w:val="1"/>
   </w:num>
 </w:numbering>
 </file>
 
 <file path=word/styles.xml><?xml version="1.0" encoding="utf-8"?>
-<w:styles xmlns:mc="http://schemas.openxmlformats.org/markup-compatibility/2006" xmlns:r="http://schemas.openxmlformats.org/officeDocument/2006/relationships" xmlns:w="http://schemas.openxmlformats.org/wordprocessingml/2006/main" xmlns:w14="http://schemas.microsoft.com/office/word/2010/wordml" xmlns:w15="http://schemas.microsoft.com/office/word/2012/wordml" xmlns:w16cex="http://schemas.microsoft.com/office/word/2018/wordml/cex" xmlns:w16cid="http://schemas.microsoft.com/office/word/2016/wordml/cid" xmlns:w16="http://schemas.microsoft.com/office/word/2018/wordml" xmlns:w16sdtdh="http://schemas.microsoft.com/office/word/2020/wordml/sdtdatahash" xmlns:w16se="http://schemas.microsoft.com/office/word/2015/wordml/symex" mc:Ignorable="w14 w15 w16se w16cid w16 w16cex w16sdtdh">
+<w:styles xmlns:mc="http://schemas.openxmlformats.org/markup-compatibility/2006" xmlns:r="http://schemas.openxmlformats.org/officeDocument/2006/relationships" xmlns:w="http://schemas.openxmlformats.org/wordprocessingml/2006/main" xmlns:w14="http://schemas.microsoft.com/office/word/2010/wordml" xmlns:w15="http://schemas.microsoft.com/office/word/2012/wordml" xmlns:w16cex="http://schemas.microsoft.com/office/word/2018/wordml/cex" xmlns:w16cid="http://schemas.microsoft.com/office/word/2016/wordml/cid" xmlns:w16="http://schemas.microsoft.com/office/word/2018/wordml" xmlns:w16se="http://schemas.microsoft.com/office/word/2015/wordml/symex" mc:Ignorable="w14 w15 w16se w16cid w16 w16cex">
   <w:docDefaults>
     <w:rPrDefault>
       <w:rPr>
@@ -4371,6 +4313,7 @@
   <w:style w:type="character" w:default="1" w:styleId="Policepardfaut">
     <w:name w:val="Default Paragraph Font"/>
     <w:uiPriority w:val="1"/>
+    <w:semiHidden/>
     <w:unhideWhenUsed/>
   </w:style>
   <w:style w:type="table" w:default="1" w:styleId="TableauNormal">
@@ -5017,10 +4960,6 @@
 </file>
 
 <file path=customXml/item1.xml><?xml version="1.0" encoding="utf-8"?>
-<b:Sources xmlns:b="http://schemas.openxmlformats.org/officeDocument/2006/bibliography" xmlns="http://schemas.openxmlformats.org/officeDocument/2006/bibliography" SelectedStyle="\APASixthEditionOfficeOnline.xsl" StyleName="APA" Version="6"/>
-</file>
-
-<file path=customXml/item2.xml><?xml version="1.0" encoding="utf-8"?>
 <ct:contentTypeSchema xmlns:ct="http://schemas.microsoft.com/office/2006/metadata/contentType" xmlns:ma="http://schemas.microsoft.com/office/2006/metadata/properties/metaAttributes" ct:_="" ma:_="" ma:contentTypeName="Document" ma:contentTypeID="0x01010090A8A68FDE73AC4D8CBDB9BFAD8C387B" ma:contentTypeVersion="12" ma:contentTypeDescription="Crée un document." ma:contentTypeScope="" ma:versionID="0ed26bf5a55ced8606c974761e09e4fa">
   <xsd:schema xmlns:xsd="http://www.w3.org/2001/XMLSchema" xmlns:xs="http://www.w3.org/2001/XMLSchema" xmlns:p="http://schemas.microsoft.com/office/2006/metadata/properties" xmlns:ns2="e22defc6-895c-4d17-8d51-52c58cbdf9c8" xmlns:ns3="f7d9f5a6-831d-4621-8c77-cbcaf993e406" targetNamespace="http://schemas.microsoft.com/office/2006/metadata/properties" ma:root="true" ma:fieldsID="ddefb2dbb2671fc4cf4f5694cdb776bd" ns2:_="" ns3:_="">
     <xsd:import namespace="e22defc6-895c-4d17-8d51-52c58cbdf9c8"/>
@@ -5235,7 +5174,7 @@
 </ct:contentTypeSchema>
 </file>
 
-<file path=customXml/item3.xml><?xml version="1.0" encoding="utf-8"?>
+<file path=customXml/item2.xml><?xml version="1.0" encoding="utf-8"?>
 <?mso-contentType ?>
 <FormTemplates xmlns="http://schemas.microsoft.com/sharepoint/v3/contenttype/forms">
   <Display>DocumentLibraryForm</Display>
@@ -5244,18 +5183,41 @@
 </FormTemplates>
 </file>
 
+<file path=customXml/item3.xml><?xml version="1.0" encoding="utf-8"?>
+<b:Sources xmlns:b="http://schemas.openxmlformats.org/officeDocument/2006/bibliography" xmlns="http://schemas.openxmlformats.org/officeDocument/2006/bibliography" SelectedStyle="\APASixthEditionOfficeOnline.xsl" StyleName="APA" Version="6"/>
+</file>
+
 <file path=customXml/itemProps1.xml><?xml version="1.0" encoding="utf-8"?>
+<ds:datastoreItem xmlns:ds="http://schemas.openxmlformats.org/officeDocument/2006/customXml" ds:itemID="{3030FE43-1AF5-4219-B946-E28A04AFBC24}">
+  <ds:schemaRefs>
+    <ds:schemaRef ds:uri="http://schemas.microsoft.com/office/2006/metadata/contentType"/>
+    <ds:schemaRef ds:uri="http://schemas.microsoft.com/office/2006/metadata/properties/metaAttributes"/>
+    <ds:schemaRef ds:uri="http://www.w3.org/2001/XMLSchema"/>
+    <ds:schemaRef ds:uri="http://schemas.microsoft.com/office/2006/metadata/properties"/>
+    <ds:schemaRef ds:uri="e22defc6-895c-4d17-8d51-52c58cbdf9c8"/>
+    <ds:schemaRef ds:uri="f7d9f5a6-831d-4621-8c77-cbcaf993e406"/>
+    <ds:schemaRef ds:uri="http://schemas.microsoft.com/office/2006/documentManagement/types"/>
+    <ds:schemaRef ds:uri="http://schemas.microsoft.com/office/infopath/2007/PartnerControls"/>
+    <ds:schemaRef ds:uri="http://schemas.openxmlformats.org/package/2006/metadata/core-properties"/>
+    <ds:schemaRef ds:uri="http://purl.org/dc/elements/1.1/"/>
+    <ds:schemaRef ds:uri="http://purl.org/dc/terms/"/>
+    <ds:schemaRef ds:uri="http://schemas.microsoft.com/internal/obd"/>
+  </ds:schemaRefs>
+</ds:datastoreItem>
+</file>
+
+<file path=customXml/itemProps2.xml><?xml version="1.0" encoding="utf-8"?>
+<ds:datastoreItem xmlns:ds="http://schemas.openxmlformats.org/officeDocument/2006/customXml" ds:itemID="{B03ABF83-E1E4-4C7B-9499-5CEDB757465A}">
+  <ds:schemaRefs>
+    <ds:schemaRef ds:uri="http://schemas.microsoft.com/sharepoint/v3/contenttype/forms"/>
+  </ds:schemaRefs>
+</ds:datastoreItem>
+</file>
+
+<file path=customXml/itemProps3.xml><?xml version="1.0" encoding="utf-8"?>
 <ds:datastoreItem xmlns:ds="http://schemas.openxmlformats.org/officeDocument/2006/customXml" ds:itemID="{AE472BBA-CF51-4B02-9A02-AA5B1827B8FE}">
   <ds:schemaRefs>
     <ds:schemaRef ds:uri="http://schemas.openxmlformats.org/officeDocument/2006/bibliography"/>
   </ds:schemaRefs>
 </ds:datastoreItem>
-</file>
-
-<file path=customXml/itemProps2.xml><?xml version="1.0" encoding="utf-8"?>
-<ds:datastoreItem xmlns:ds="http://schemas.openxmlformats.org/officeDocument/2006/customXml" ds:itemID="{3030FE43-1AF5-4219-B946-E28A04AFBC24}"/>
-</file>
-
-<file path=customXml/itemProps3.xml><?xml version="1.0" encoding="utf-8"?>
-<ds:datastoreItem xmlns:ds="http://schemas.openxmlformats.org/officeDocument/2006/customXml" ds:itemID="{B03ABF83-E1E4-4C7B-9499-5CEDB757465A}"/>
 </file>
</xml_diff>